<commit_message>
Cập nhật sơ đồ thiết kế chuyên nghiệp và nhúng vào Word
- ERD đầy đủ 5 bảng với màu sắc, PK/FK badges
- Class diagram ITinhGiaService + LoaiKhuyenMai enum
- Kiến trúc phân tầng N-Layer
- Sequence diagram luồng đặt hàng

https://claude.ai/code/session_01XMBtZ7arxo1WmwCViUwh6e
</commit_message>
<xml_diff>
--- a/MASV_NGUYENVANA/ThietKe.docx
+++ b/MASV_NGUYENVANA/ThietKe.docx
@@ -4,20 +4,29 @@
   <w:body>
     <w:p>
       <w:pPr>
-        <w:pStyle w:val="Title"/>
         <w:jc w:val="center"/>
       </w:pPr>
       <w:r>
+        <w:rPr>
+          <w:b/>
+          <w:color w:val="1E3A5F"/>
+          <w:sz w:val="36"/>
+        </w:rPr>
         <w:t>BÀI KIỂM TRA GIỮA KỲ</w:t>
+        <w:br/>
+        <w:t>KIẾN TRÚC VÀ THIẾT KẾ PHẦN MỀM</w:t>
       </w:r>
     </w:p>
+    <w:p/>
     <w:p>
       <w:pPr>
-        <w:pStyle w:val="Heading1"/>
         <w:jc w:val="center"/>
       </w:pPr>
       <w:r>
-        <w:t>KIẾN TRÚC VÀ THIẾT KẾ PHẦN MỀM</w:t>
+        <w:rPr>
+          <w:sz w:val="24"/>
+        </w:rPr>
+        <w:t>Họ và tên:   Nguyễn Văn A</w:t>
       </w:r>
     </w:p>
     <w:p>
@@ -25,7 +34,10 @@
         <w:jc w:val="center"/>
       </w:pPr>
       <w:r>
-        <w:t>Môn học: Kiến Trúc Và Thiết Kế Phần Mềm</w:t>
+        <w:rPr>
+          <w:sz w:val="24"/>
+        </w:rPr>
+        <w:t>MSSV:        XXXXXXXX</w:t>
       </w:r>
     </w:p>
     <w:p>
@@ -33,7 +45,10 @@
         <w:jc w:val="center"/>
       </w:pPr>
       <w:r>
-        <w:t>Họ và tên: Nguyễn Văn A</w:t>
+        <w:rPr>
+          <w:sz w:val="24"/>
+        </w:rPr>
+        <w:t>Lớp:         KTTKPM - XX</w:t>
       </w:r>
     </w:p>
     <w:p>
@@ -41,15 +56,25 @@
         <w:jc w:val="center"/>
       </w:pPr>
       <w:r>
-        <w:t>MSSV: XXXXXXXX</w:t>
+        <w:rPr>
+          <w:sz w:val="24"/>
+        </w:rPr>
+        <w:t>Thời gian:   48 giờ</w:t>
       </w:r>
     </w:p>
-    <w:p/>
+    <w:p>
+      <w:r>
+        <w:br w:type="page"/>
+      </w:r>
+    </w:p>
     <w:p>
       <w:pPr>
         <w:pStyle w:val="Heading1"/>
       </w:pPr>
       <w:r>
+        <w:rPr>
+          <w:color w:val="1E3A5F"/>
+        </w:rPr>
         <w:t>CÂU 1 — MỞ RỘNG THIẾT KẾ</w:t>
       </w:r>
     </w:p>
@@ -58,93 +83,386 @@
         <w:pStyle w:val="Heading2"/>
       </w:pPr>
       <w:r>
+        <w:rPr>
+          <w:color w:val="2E86AB"/>
+        </w:rPr>
         <w:t>1.1 Sơ Đồ ERD — Module Quản Lý Khuyến Mãi</w:t>
       </w:r>
     </w:p>
     <w:p>
       <w:r>
-        <w:t>Bổ sung module Quản Lý Khuyến Mãi vào hệ thống bán trái cây. Sơ đồ ERD dưới đây mô tả các bảng dữ liệu mới và mối quan hệ với bảng Đơn Hàng (DON_HANG).</w:t>
+        <w:rPr>
+          <w:sz w:val="22"/>
+        </w:rPr>
+        <w:t>Để mở rộng hệ thống bán trái cây với module Quản Lý Khuyến Mãi, ta bổ sung bảng KHUYEN_MAI và thêm khóa ngoại MaVoucher vào bảng DON_HANG. Sơ đồ ERD bên dưới thể hiện đầy đủ các bảng dữ liệu và mối quan hệ:</w:t>
+      </w:r>
+    </w:p>
+    <w:p/>
+    <w:p>
+      <w:pPr>
+        <w:jc w:val="center"/>
+      </w:pPr>
+      <w:r>
+        <w:drawing>
+          <wp:inline xmlns:a="http://schemas.openxmlformats.org/drawingml/2006/main" xmlns:pic="http://schemas.openxmlformats.org/drawingml/2006/picture">
+            <wp:extent cx="5943600" cy="3636996"/>
+            <wp:docPr id="1" name="Picture 1"/>
+            <wp:cNvGraphicFramePr>
+              <a:graphicFrameLocks noChangeAspect="1"/>
+            </wp:cNvGraphicFramePr>
+            <a:graphic>
+              <a:graphicData uri="http://schemas.openxmlformats.org/drawingml/2006/picture">
+                <pic:pic>
+                  <pic:nvPicPr>
+                    <pic:cNvPr id="0" name="erd.png"/>
+                    <pic:cNvPicPr/>
+                  </pic:nvPicPr>
+                  <pic:blipFill>
+                    <a:blip r:embed="rId9"/>
+                    <a:stretch>
+                      <a:fillRect/>
+                    </a:stretch>
+                  </pic:blipFill>
+                  <pic:spPr>
+                    <a:xfrm>
+                      <a:off x="0" y="0"/>
+                      <a:ext cx="5943600" cy="3636996"/>
+                    </a:xfrm>
+                    <a:prstGeom prst="rect"/>
+                  </pic:spPr>
+                </pic:pic>
+              </a:graphicData>
+            </a:graphic>
+          </wp:inline>
+        </w:drawing>
       </w:r>
     </w:p>
     <w:p>
       <w:pPr>
-        <w:pStyle w:val="NoSpacing"/>
+        <w:jc w:val="center"/>
       </w:pPr>
       <w:r>
         <w:rPr>
-          <w:rFonts w:ascii="Courier New" w:hAnsi="Courier New"/>
+          <w:i/>
+          <w:color w:val="555555"/>
           <w:sz w:val="18"/>
         </w:rPr>
-        <w:br/>
-        <w:t>Bảng KHUYEN_MAI (mới):</w:t>
-        <w:br/>
-        <w:t>┌─────────────────────────────────────────────────────────┐</w:t>
-        <w:br/>
-        <w:t>│                     KHUYEN_MAI                           │</w:t>
-        <w:br/>
-        <w:t>├─────────────────────────────────────────────────────────┤</w:t>
-        <w:br/>
-        <w:t>│ PK  MaKhuyenMai     INT                                 │</w:t>
-        <w:br/>
-        <w:t>│     MaVoucher       NVARCHAR(50)   UNIQUE               │</w:t>
-        <w:br/>
-        <w:t>│     TenKhuyenMai    NVARCHAR(200)                       │</w:t>
-        <w:br/>
-        <w:t>│     LoaiKhuyenMai   NVARCHAR(30)                        │</w:t>
-        <w:br/>
-        <w:t>│        → GiamTheoTienMat / GiamTheoPhantram / MuaNTangM │</w:t>
-        <w:br/>
-        <w:t>│     GiaTriGiam      DECIMAL(18,2)                       │</w:t>
-        <w:br/>
-        <w:t>│     DonHangToiThieu DECIMAL(18,2)                       │</w:t>
-        <w:br/>
-        <w:t>│     NgayBatDau      DATETIME                            │</w:t>
-        <w:br/>
-        <w:t>│     NgayKetThuc     DATETIME                            │</w:t>
-        <w:br/>
-        <w:t>└─────────────────────────────────────────────────────────┘</w:t>
-        <w:br/>
-        <w:br/>
-        <w:t>Bảng DON_HANG (bổ sung khóa ngoại):</w:t>
-        <w:br/>
-        <w:t>┌───────────────────────────────┐</w:t>
-        <w:br/>
-        <w:t>│         DON_HANG              │</w:t>
-        <w:br/>
-        <w:t>├───────────────────────────────┤</w:t>
-        <w:br/>
-        <w:t>│ PK  MaDonHang     INT         │</w:t>
-        <w:br/>
-        <w:t>│ FK  MaKhachHang   INT         │</w:t>
-        <w:br/>
-        <w:t>│ FK  MaVoucher     NVARCHAR  ◄─┼── liên kết KHUYEN_MAI (nullable)</w:t>
-        <w:br/>
-        <w:t>│     NgayDatHang   DATETIME    │</w:t>
-        <w:br/>
-        <w:t>│     TrangThai     NVARCHAR    │</w:t>
-        <w:br/>
-        <w:t>│     TongTienGoc   DECIMAL     │</w:t>
-        <w:br/>
-        <w:t>│     SoTienGiam    DECIMAL     │</w:t>
-        <w:br/>
-        <w:t>│     TongTienThanhToan DECIMAL │</w:t>
-        <w:br/>
-        <w:t>└───────────────────────────────┘</w:t>
-        <w:br/>
-        <w:br/>
-        <w:t>Quan hệ:</w:t>
-        <w:br/>
-        <w:t xml:space="preserve">  KHUYEN_MAI  1 ──── N  DON_HANG</w:t>
-        <w:br/>
-        <w:t xml:space="preserve">  (Một mã voucher có thể dùng cho nhiều đơn hàng, nullable)</w:t>
-        <w:br/>
-        <w:br/>
-        <w:t xml:space="preserve">  KHACH_HANG  1 ──── N  DON_HANG</w:t>
-        <w:br/>
-        <w:t xml:space="preserve">  DON_HANG    1 ──── N  CHI_TIET_DON_HANG</w:t>
-        <w:br/>
-        <w:t xml:space="preserve">  SAN_PHAM    1 ──── N  CHI_TIET_DON_HANG</w:t>
-        <w:br/>
+        <w:t>Hình 1.1 — Sơ đồ ERD hệ thống bán trái cây (bảng xanh lá = bảng mới)</w:t>
+      </w:r>
+    </w:p>
+    <w:p/>
+    <w:p>
+      <w:r>
+        <w:rPr>
+          <w:sz w:val="22"/>
+        </w:rPr>
+        <w:t>Mô tả các mối quan hệ chính:</w:t>
+      </w:r>
+    </w:p>
+    <w:tbl>
+      <w:tblPr>
+        <w:tblStyle w:val="TableGrid"/>
+        <w:tblW w:type="auto" w:w="0"/>
+        <w:tblLook w:firstColumn="1" w:firstRow="1" w:lastColumn="0" w:lastRow="0" w:noHBand="0" w:noVBand="1" w:val="04A0"/>
+      </w:tblPr>
+      <w:tblGrid>
+        <w:gridCol w:w="3135"/>
+        <w:gridCol w:w="3135"/>
+        <w:gridCol w:w="3135"/>
+      </w:tblGrid>
+      <w:tr>
+        <w:tc>
+          <w:tcPr>
+            <w:tcW w:type="dxa" w:w="3135"/>
+          </w:tcPr>
+          <w:p>
+            <w:r>
+              <w:rPr>
+                <w:b/>
+                <w:color w:val="1E3A5F"/>
+              </w:rPr>
+              <w:t>Bảng A</w:t>
+            </w:r>
+          </w:p>
+        </w:tc>
+        <w:tc>
+          <w:tcPr>
+            <w:tcW w:type="dxa" w:w="3135"/>
+          </w:tcPr>
+          <w:p>
+            <w:r>
+              <w:rPr>
+                <w:b/>
+                <w:color w:val="1E3A5F"/>
+              </w:rPr>
+              <w:t>Quan Hệ</w:t>
+            </w:r>
+          </w:p>
+        </w:tc>
+        <w:tc>
+          <w:tcPr>
+            <w:tcW w:type="dxa" w:w="3135"/>
+          </w:tcPr>
+          <w:p>
+            <w:r>
+              <w:rPr>
+                <w:b/>
+                <w:color w:val="1E3A5F"/>
+              </w:rPr>
+              <w:t>Bảng B</w:t>
+            </w:r>
+          </w:p>
+        </w:tc>
+      </w:tr>
+      <w:tr>
+        <w:tc>
+          <w:tcPr>
+            <w:tcW w:type="dxa" w:w="3135"/>
+          </w:tcPr>
+          <w:p>
+            <w:r>
+              <w:t>KHACH_HANG</w:t>
+            </w:r>
+          </w:p>
+        </w:tc>
+        <w:tc>
+          <w:tcPr>
+            <w:tcW w:type="dxa" w:w="3135"/>
+          </w:tcPr>
+          <w:p>
+            <w:r>
+              <w:t>1 ──── N</w:t>
+            </w:r>
+          </w:p>
+        </w:tc>
+        <w:tc>
+          <w:tcPr>
+            <w:tcW w:type="dxa" w:w="3135"/>
+          </w:tcPr>
+          <w:p>
+            <w:r>
+              <w:t>DON_HANG</w:t>
+            </w:r>
+          </w:p>
+        </w:tc>
+      </w:tr>
+      <w:tr>
+        <w:tc>
+          <w:tcPr>
+            <w:tcW w:type="dxa" w:w="3135"/>
+          </w:tcPr>
+          <w:p>
+            <w:r>
+              <w:t>DON_HANG</w:t>
+            </w:r>
+          </w:p>
+        </w:tc>
+        <w:tc>
+          <w:tcPr>
+            <w:tcW w:type="dxa" w:w="3135"/>
+          </w:tcPr>
+          <w:p>
+            <w:r>
+              <w:t>1 ──── N</w:t>
+            </w:r>
+          </w:p>
+        </w:tc>
+        <w:tc>
+          <w:tcPr>
+            <w:tcW w:type="dxa" w:w="3135"/>
+          </w:tcPr>
+          <w:p>
+            <w:r>
+              <w:t>CHI_TIET_DON_HANG</w:t>
+            </w:r>
+          </w:p>
+        </w:tc>
+      </w:tr>
+      <w:tr>
+        <w:tc>
+          <w:tcPr>
+            <w:tcW w:type="dxa" w:w="3135"/>
+          </w:tcPr>
+          <w:p>
+            <w:r>
+              <w:t>SAN_PHAM</w:t>
+            </w:r>
+          </w:p>
+        </w:tc>
+        <w:tc>
+          <w:tcPr>
+            <w:tcW w:type="dxa" w:w="3135"/>
+          </w:tcPr>
+          <w:p>
+            <w:r>
+              <w:t>1 ──── N</w:t>
+            </w:r>
+          </w:p>
+        </w:tc>
+        <w:tc>
+          <w:tcPr>
+            <w:tcW w:type="dxa" w:w="3135"/>
+          </w:tcPr>
+          <w:p>
+            <w:r>
+              <w:t>CHI_TIET_DON_HANG</w:t>
+            </w:r>
+          </w:p>
+        </w:tc>
+      </w:tr>
+      <w:tr>
+        <w:tc>
+          <w:tcPr>
+            <w:tcW w:type="dxa" w:w="3135"/>
+          </w:tcPr>
+          <w:p>
+            <w:r>
+              <w:t>KHUYEN_MAI</w:t>
+            </w:r>
+          </w:p>
+        </w:tc>
+        <w:tc>
+          <w:tcPr>
+            <w:tcW w:type="dxa" w:w="3135"/>
+          </w:tcPr>
+          <w:p>
+            <w:r>
+              <w:t>1 ──── N (nullable)</w:t>
+            </w:r>
+          </w:p>
+        </w:tc>
+        <w:tc>
+          <w:tcPr>
+            <w:tcW w:type="dxa" w:w="3135"/>
+          </w:tcPr>
+          <w:p>
+            <w:r>
+              <w:t>DON_HANG</w:t>
+            </w:r>
+          </w:p>
+        </w:tc>
+      </w:tr>
+    </w:tbl>
+    <w:p/>
+    <w:p>
+      <w:pPr>
+        <w:pStyle w:val="Heading2"/>
+      </w:pPr>
+      <w:r>
+        <w:rPr>
+          <w:color w:val="2E86AB"/>
+        </w:rPr>
+        <w:t>1.2 Interface Dịch Vụ Tính Giá — ITinhGiaService</w:t>
+      </w:r>
+    </w:p>
+    <w:p>
+      <w:r>
+        <w:rPr>
+          <w:sz w:val="22"/>
+        </w:rPr>
+        <w:t>Interface ITinhGiaService được thiết kế theo nguyên tắc Open/Closed: thêm loại chiết khấu mới không cần sửa code hiện có, chỉ cần mở rộng TinhGiaService hoặc tạo class mới implement interface này.</w:t>
+      </w:r>
+    </w:p>
+    <w:p/>
+    <w:p>
+      <w:pPr>
+        <w:jc w:val="center"/>
+      </w:pPr>
+      <w:r>
+        <w:drawing>
+          <wp:inline xmlns:a="http://schemas.openxmlformats.org/drawingml/2006/main" xmlns:pic="http://schemas.openxmlformats.org/drawingml/2006/picture">
+            <wp:extent cx="5669280" cy="3032406"/>
+            <wp:docPr id="2" name="Picture 2"/>
+            <wp:cNvGraphicFramePr>
+              <a:graphicFrameLocks noChangeAspect="1"/>
+            </wp:cNvGraphicFramePr>
+            <a:graphic>
+              <a:graphicData uri="http://schemas.openxmlformats.org/drawingml/2006/picture">
+                <pic:pic>
+                  <pic:nvPicPr>
+                    <pic:cNvPr id="0" name="interface_tinh_gia.png"/>
+                    <pic:cNvPicPr/>
+                  </pic:nvPicPr>
+                  <pic:blipFill>
+                    <a:blip r:embed="rId10"/>
+                    <a:stretch>
+                      <a:fillRect/>
+                    </a:stretch>
+                  </pic:blipFill>
+                  <pic:spPr>
+                    <a:xfrm>
+                      <a:off x="0" y="0"/>
+                      <a:ext cx="5669280" cy="3032406"/>
+                    </a:xfrm>
+                    <a:prstGeom prst="rect"/>
+                  </pic:spPr>
+                </pic:pic>
+              </a:graphicData>
+            </a:graphic>
+          </wp:inline>
+        </w:drawing>
+      </w:r>
+    </w:p>
+    <w:p>
+      <w:pPr>
+        <w:jc w:val="center"/>
+      </w:pPr>
+      <w:r>
+        <w:rPr>
+          <w:i/>
+          <w:color w:val="555555"/>
+          <w:sz w:val="18"/>
+        </w:rPr>
+        <w:t>Hình 1.2 — Sơ đồ class ITinhGiaService và các thành phần liên quan</w:t>
+      </w:r>
+    </w:p>
+    <w:p/>
+    <w:p>
+      <w:r>
+        <w:rPr>
+          <w:sz w:val="22"/>
+        </w:rPr>
+        <w:t>Hỗ trợ 3 loại chiết khấu được định nghĩa trong enum LoaiKhuyenMai:</w:t>
+      </w:r>
+    </w:p>
+    <w:p>
+      <w:r>
+        <w:rPr>
+          <w:sz w:val="22"/>
+        </w:rPr>
+        <w:t>• GiamTheoTienMat  — Giảm số tiền cố định (VNĐ), không vượt tổng tiền đơn hàng.</w:t>
+      </w:r>
+    </w:p>
+    <w:p>
+      <w:r>
+        <w:rPr>
+          <w:sz w:val="22"/>
+        </w:rPr>
+        <w:t>• GiamTheoPhantram — Giảm theo phần trăm, có áp trần tối đa 100.000 VNĐ.</w:t>
+      </w:r>
+    </w:p>
+    <w:p>
+      <w:r>
+        <w:rPr>
+          <w:sz w:val="22"/>
+        </w:rPr>
+        <w:t>• MuaNTangM        — Tặng hàng hóa tương đương giá trị nhất định.</w:t>
+      </w:r>
+    </w:p>
+    <w:p>
+      <w:r>
+        <w:br w:type="page"/>
+      </w:r>
+    </w:p>
+    <w:p>
+      <w:pPr>
+        <w:pStyle w:val="Heading1"/>
+      </w:pPr>
+      <w:r>
+        <w:rPr>
+          <w:color w:val="1E3A5F"/>
+        </w:rPr>
+        <w:t>CÂU 2 — TRIỂN KHAI CHỨC NĂNG XÁC NHẬN ĐẶT HÀNG (C#)</w:t>
       </w:r>
     </w:p>
     <w:p>
@@ -152,63 +470,251 @@
         <w:pStyle w:val="Heading2"/>
       </w:pPr>
       <w:r>
-        <w:t>1.2 Interface Dịch Vụ Tính Giá</w:t>
-      </w:r>
-    </w:p>
-    <w:p>
-      <w:r>
-        <w:t>Interface ITinhGiaService được thiết kế để có thể áp dụng nhiều loại mã giảm giá khác nhau mà không cần sửa code hiện có (tuân thủ Open/Closed Principle).</w:t>
+        <w:rPr>
+          <w:color w:val="2E86AB"/>
+        </w:rPr>
+        <w:t>2.1 Design Pattern — Builder Pattern</w:t>
       </w:r>
     </w:p>
     <w:p>
       <w:r>
         <w:rPr>
+          <w:sz w:val="22"/>
+        </w:rPr>
+        <w:t>Áp dụng Builder Pattern để tạo đối tượng DonHang. Đối tượng đơn hàng có nhiều thuộc tính tùy chọn (danh sách sản phẩm, voucher…). Builder Pattern cho phép xây dựng đơn hàng từng bước theo kiểu Method Chaining, code dễ đọc như ngôn ngữ tự nhiên và tránh constructor quá nhiều tham số.</w:t>
+      </w:r>
+    </w:p>
+    <w:p>
+      <w:pPr>
+        <w:spacing w:before="80" w:after="80"/>
+        <w:ind w:left="567"/>
+        <w:shd w:val="clear" w:color="auto" w:fill="EBF5FB"/>
+      </w:pPr>
+      <w:r>
+        <w:rPr>
           <w:rFonts w:ascii="Courier New" w:hAnsi="Courier New"/>
-          <w:sz w:val="18"/>
+          <w:color w:val="1E3A5F"/>
+          <w:sz w:val="17"/>
         </w:rPr>
+        <w:t>// ── Sử dụng DonHangBuilder (Builder Pattern) ──────────────────────</w:t>
         <w:br/>
-        <w:t>«interface»</w:t>
+        <w:t>var donHang = new DonHangBuilder()</w:t>
         <w:br/>
-        <w:t>ITinhGiaService</w:t>
+        <w:t xml:space="preserve">    .VoiKhachHang(101, "Nguyễn Văn An", "123 Lê Lợi, TP.HCM")</w:t>
         <w:br/>
-        <w:t>──────────────────────────────────────────────────────</w:t>
+        <w:t xml:space="preserve">    .ThemSanPham(maSanPham: 1, soLuong: 2)   // 2 kg Xoài Cát Hòa Lộc</w:t>
         <w:br/>
-        <w:t>+ TinhSoTienGiam(tongTienGoc: decimal,</w:t>
+        <w:t xml:space="preserve">    .ThemSanPham(maSanPham: 3, soLuong: 3)   // 3 kg Bưởi Da Xanh</w:t>
         <w:br/>
-        <w:t xml:space="preserve">                 khuyenMai: KhuyenMai) : decimal</w:t>
+        <w:t xml:space="preserve">    .ApDungVoucher("GIAM50K")</w:t>
         <w:br/>
-        <w:t xml:space="preserve">  → Trả về số tiền được giảm</w:t>
+        <w:t xml:space="preserve">    .Build();</w:t>
         <w:br/>
         <w:br/>
-        <w:t>+ TinhTongTienSauGiam(tongTienGoc: decimal,</w:t>
+        <w:t>// ── Gọi service xác nhận đặt hàng ─────────────────────────────────</w:t>
         <w:br/>
-        <w:t xml:space="preserve">                      khuyenMai: KhuyenMai?) : decimal</w:t>
+        <w:t>var ketQua = donHangSvc.XacNhanDatHang(donHang);</w:t>
         <w:br/>
-        <w:t xml:space="preserve">  → Trả về tổng tiền sau khi áp dụng khuyến mãi</w:t>
-        <w:br/>
-        <w:t xml:space="preserve">          ▲</w:t>
-        <w:br/>
-        <w:t xml:space="preserve">          │ implements</w:t>
-        <w:br/>
-        <w:t xml:space="preserve">          │</w:t>
-        <w:br/>
-        <w:t xml:space="preserve">   TinhGiaService</w:t>
-        <w:br/>
-        <w:t>──────────────────────────────────────────────────────</w:t>
-        <w:br/>
-        <w:t xml:space="preserve">  Hỗ trợ 3 loại chiết khấu:</w:t>
-        <w:br/>
-        <w:t xml:space="preserve">  • GiamTheoTienMat  → giảm số tiền cố định (VNĐ)</w:t>
-        <w:br/>
-        <w:t xml:space="preserve">  • GiamTheoPhantram → giảm theo % (có áp trần 100.000 VNĐ)</w:t>
-        <w:br/>
-        <w:t xml:space="preserve">  • MuaNTangM        → tặng hàng tương đương số tiền nhất định</w:t>
-        <w:br/>
+        <w:t>ketQua.HienThiDonHang();</w:t>
+      </w:r>
+    </w:p>
+    <w:p>
+      <w:pPr>
+        <w:pStyle w:val="Heading2"/>
+      </w:pPr>
+      <w:r>
+        <w:rPr>
+          <w:color w:val="2E86AB"/>
+        </w:rPr>
+        <w:t>2.2 Kiến Trúc Phân Tầng</w:t>
       </w:r>
     </w:p>
     <w:p>
       <w:r>
-        <w:t>Lý do dùng Interface: Khi cần thêm loại chiết khấu mới (ví dụ: giảm theo thành viên VIP), chỉ cần tạo class mới implement ITinhGiaService mà không ảnh hưởng code hiện tại.</w:t>
+        <w:rPr>
+          <w:sz w:val="22"/>
+        </w:rPr>
+        <w:t>Hệ thống được chia thành 4 tầng rõ ràng theo mô hình N-Layer, kết hợp Repository Pattern và Dependency Injection để tách biệt các mối quan tâm.</w:t>
+      </w:r>
+    </w:p>
+    <w:p/>
+    <w:p>
+      <w:pPr>
+        <w:jc w:val="center"/>
+      </w:pPr>
+      <w:r>
+        <w:drawing>
+          <wp:inline xmlns:a="http://schemas.openxmlformats.org/drawingml/2006/main" xmlns:pic="http://schemas.openxmlformats.org/drawingml/2006/picture">
+            <wp:extent cx="5669280" cy="3222109"/>
+            <wp:docPr id="3" name="Picture 3"/>
+            <wp:cNvGraphicFramePr>
+              <a:graphicFrameLocks noChangeAspect="1"/>
+            </wp:cNvGraphicFramePr>
+            <a:graphic>
+              <a:graphicData uri="http://schemas.openxmlformats.org/drawingml/2006/picture">
+                <pic:pic>
+                  <pic:nvPicPr>
+                    <pic:cNvPr id="0" name="kien_truc_phan_tang.png"/>
+                    <pic:cNvPicPr/>
+                  </pic:nvPicPr>
+                  <pic:blipFill>
+                    <a:blip r:embed="rId11"/>
+                    <a:stretch>
+                      <a:fillRect/>
+                    </a:stretch>
+                  </pic:blipFill>
+                  <pic:spPr>
+                    <a:xfrm>
+                      <a:off x="0" y="0"/>
+                      <a:ext cx="5669280" cy="3222109"/>
+                    </a:xfrm>
+                    <a:prstGeom prst="rect"/>
+                  </pic:spPr>
+                </pic:pic>
+              </a:graphicData>
+            </a:graphic>
+          </wp:inline>
+        </w:drawing>
+      </w:r>
+    </w:p>
+    <w:p>
+      <w:pPr>
+        <w:jc w:val="center"/>
+      </w:pPr>
+      <w:r>
+        <w:rPr>
+          <w:i/>
+          <w:color w:val="555555"/>
+          <w:sz w:val="18"/>
+        </w:rPr>
+        <w:t>Hình 2.1 — Kiến trúc phân tầng với Repository Pattern và DI</w:t>
+      </w:r>
+    </w:p>
+    <w:p/>
+    <w:p>
+      <w:pPr>
+        <w:pStyle w:val="Heading2"/>
+      </w:pPr>
+      <w:r>
+        <w:rPr>
+          <w:color w:val="2E86AB"/>
+        </w:rPr>
+        <w:t>2.3 Luồng Xử Lý Xác Nhận Đặt Hàng</w:t>
+      </w:r>
+    </w:p>
+    <w:p>
+      <w:r>
+        <w:rPr>
+          <w:sz w:val="22"/>
+        </w:rPr>
+        <w:t>Luồng xử lý trong DonHangService.XacNhanDatHang() trải qua 6 bước tuần tự:</w:t>
+      </w:r>
+    </w:p>
+    <w:p>
+      <w:r>
+        <w:rPr>
+          <w:sz w:val="22"/>
+        </w:rPr>
+        <w:t>1. Validate đầu vào — kiểm tra đơn hàng không rỗng, số lượng &gt; 0.</w:t>
+      </w:r>
+    </w:p>
+    <w:p>
+      <w:r>
+        <w:rPr>
+          <w:sz w:val="22"/>
+        </w:rPr>
+        <w:t>2. Đồng bộ giá từ Repository — lấy giá chính thức từ CSDL, không tin giá từ client.</w:t>
+      </w:r>
+    </w:p>
+    <w:p>
+      <w:r>
+        <w:rPr>
+          <w:sz w:val="22"/>
+        </w:rPr>
+        <w:t>3. Kiểm tra tồn kho — nếu không đủ → ném TonKhoKhongDuException.</w:t>
+      </w:r>
+    </w:p>
+    <w:p>
+      <w:r>
+        <w:rPr>
+          <w:sz w:val="22"/>
+        </w:rPr>
+        <w:t>4. Áp dụng khuyến mãi — validate voucher và tính số tiền giảm.</w:t>
+      </w:r>
+    </w:p>
+    <w:p>
+      <w:r>
+        <w:rPr>
+          <w:sz w:val="22"/>
+        </w:rPr>
+        <w:t>5. Lưu đơn hàng — ghi vào Repository với trạng thái DaXacNhan.</w:t>
+      </w:r>
+    </w:p>
+    <w:p>
+      <w:r>
+        <w:rPr>
+          <w:sz w:val="22"/>
+        </w:rPr>
+        <w:t>6. Cập nhật tồn kho — trừ số lượng sản phẩm đã đặt.</w:t>
+      </w:r>
+    </w:p>
+    <w:p/>
+    <w:p>
+      <w:pPr>
+        <w:jc w:val="center"/>
+      </w:pPr>
+      <w:r>
+        <w:drawing>
+          <wp:inline xmlns:a="http://schemas.openxmlformats.org/drawingml/2006/main" xmlns:pic="http://schemas.openxmlformats.org/drawingml/2006/picture">
+            <wp:extent cx="5943600" cy="3805614"/>
+            <wp:docPr id="4" name="Picture 4"/>
+            <wp:cNvGraphicFramePr>
+              <a:graphicFrameLocks noChangeAspect="1"/>
+            </wp:cNvGraphicFramePr>
+            <a:graphic>
+              <a:graphicData uri="http://schemas.openxmlformats.org/drawingml/2006/picture">
+                <pic:pic>
+                  <pic:nvPicPr>
+                    <pic:cNvPr id="0" name="luong_dat_hang.png"/>
+                    <pic:cNvPicPr/>
+                  </pic:nvPicPr>
+                  <pic:blipFill>
+                    <a:blip r:embed="rId12"/>
+                    <a:stretch>
+                      <a:fillRect/>
+                    </a:stretch>
+                  </pic:blipFill>
+                  <pic:spPr>
+                    <a:xfrm>
+                      <a:off x="0" y="0"/>
+                      <a:ext cx="5943600" cy="3805614"/>
+                    </a:xfrm>
+                    <a:prstGeom prst="rect"/>
+                  </pic:spPr>
+                </pic:pic>
+              </a:graphicData>
+            </a:graphic>
+          </wp:inline>
+        </w:drawing>
+      </w:r>
+    </w:p>
+    <w:p>
+      <w:pPr>
+        <w:jc w:val="center"/>
+      </w:pPr>
+      <w:r>
+        <w:rPr>
+          <w:i/>
+          <w:color w:val="555555"/>
+          <w:sz w:val="18"/>
+        </w:rPr>
+        <w:t>Hình 2.2 — Luồng xử lý xác nhận đặt hàng (Sequence Diagram)</w:t>
+      </w:r>
+    </w:p>
+    <w:p/>
+    <w:p>
+      <w:r>
+        <w:br w:type="page"/>
       </w:r>
     </w:p>
     <w:p>
@@ -216,145 +722,9 @@
         <w:pStyle w:val="Heading1"/>
       </w:pPr>
       <w:r>
-        <w:t>CÂU 2 — TRIỂN KHAI CHỨC NĂNG XÁC NHẬN ĐẶT HÀNG</w:t>
-      </w:r>
-    </w:p>
-    <w:p>
-      <w:pPr>
-        <w:pStyle w:val="Heading2"/>
-      </w:pPr>
-      <w:r>
-        <w:t>2.1 Design Pattern — Builder Pattern</w:t>
-      </w:r>
-    </w:p>
-    <w:p>
-      <w:r>
-        <w:t>Áp dụng Builder Pattern để tạo đối tượng DonHang. Đối tượng đơn hàng có nhiều thuộc tính tùy chọn (voucher, nhiều sản phẩm), Builder Pattern giúp tạo đơn hàng từng bước theo kiểu method chaining, code dễ đọc và tránh constructor quá nhiều tham số.</w:t>
-      </w:r>
-    </w:p>
-    <w:p>
-      <w:r>
         <w:rPr>
-          <w:rFonts w:ascii="Courier New" w:hAnsi="Courier New"/>
-          <w:sz w:val="18"/>
+          <w:color w:val="1E3A5F"/>
         </w:rPr>
-        <w:t>// Cách sử dụng Builder Pattern</w:t>
-        <w:br/>
-        <w:t>var donHang = new DonHangBuilder()</w:t>
-        <w:br/>
-        <w:t xml:space="preserve">    .VoiKhachHang(101, "Nguyễn Văn An", "123 Lê Lợi, TP.HCM")</w:t>
-        <w:br/>
-        <w:t xml:space="preserve">    .ThemSanPham(maSanPham: 1, soLuong: 2)   // 2 kg Xoài</w:t>
-        <w:br/>
-        <w:t xml:space="preserve">    .ThemSanPham(maSanPham: 3, soLuong: 3)   // 3 kg Bưởi</w:t>
-        <w:br/>
-        <w:t xml:space="preserve">    .ApDungVoucher("GIAM50K")</w:t>
-        <w:br/>
-        <w:t xml:space="preserve">    .Build();</w:t>
-        <w:br/>
-      </w:r>
-    </w:p>
-    <w:p>
-      <w:pPr>
-        <w:pStyle w:val="Heading2"/>
-      </w:pPr>
-      <w:r>
-        <w:t>2.2 Kiến Trúc Phân Tầng</w:t>
-      </w:r>
-    </w:p>
-    <w:p>
-      <w:r>
-        <w:rPr>
-          <w:rFonts w:ascii="Courier New" w:hAnsi="Courier New"/>
-          <w:sz w:val="18"/>
-        </w:rPr>
-        <w:br/>
-        <w:t>┌──────────────────────────────────────────────────┐</w:t>
-        <w:br/>
-        <w:t>│              TẦNG TRÌNH BÀY                       │</w:t>
-        <w:br/>
-        <w:t>│   Program.cs — Console, nhận input, in kết quả   │</w:t>
-        <w:br/>
-        <w:t>└────────────────────┬─────────────────────────────┘</w:t>
-        <w:br/>
-        <w:t xml:space="preserve">                     │ gọi (DI)</w:t>
-        <w:br/>
-        <w:t>┌────────────────────▼─────────────────────────────┐</w:t>
-        <w:br/>
-        <w:t>│              TẦNG NGHIỆP VỤ                       │</w:t>
-        <w:br/>
-        <w:t>│   DonHangService  — luồng xác nhận đặt hàng      │</w:t>
-        <w:br/>
-        <w:t>│   TinhGiaService  — tính giá sau khuyến mãi      │</w:t>
-        <w:br/>
-        <w:t>└──────┬──────────────────────┬────────────────────┘</w:t>
-        <w:br/>
-        <w:t xml:space="preserve">       │ DI                   │ DI</w:t>
-        <w:br/>
-        <w:t>┌──────▼──────┐  ┌────────────▼────┐  ┌────────────┐</w:t>
-        <w:br/>
-        <w:t>│ TẦNG DỮ LIỆU│  │ TẦNG DỮ LIỆU   │  │TẦNG DỮ LI. │</w:t>
-        <w:br/>
-        <w:t>│SanPhamRepo. │  │ DonHangRepo.    │  │KhuyenMaiR. │</w:t>
-        <w:br/>
-        <w:t>└─────────────┘  └─────────────────┘  └────────────┘</w:t>
-        <w:br/>
-      </w:r>
-    </w:p>
-    <w:p>
-      <w:pPr>
-        <w:pStyle w:val="Heading2"/>
-      </w:pPr>
-      <w:r>
-        <w:t>2.3 Luồng Xử Lý Xác Nhận Đặt Hàng</w:t>
-      </w:r>
-    </w:p>
-    <w:p>
-      <w:r>
-        <w:rPr>
-          <w:rFonts w:ascii="Courier New" w:hAnsi="Courier New"/>
-          <w:sz w:val="18"/>
-        </w:rPr>
-        <w:br/>
-        <w:t>Người Dùng → DonHangBuilder.Build() → DonHang</w:t>
-        <w:br/>
-        <w:t xml:space="preserve">                                           │</w:t>
-        <w:br/>
-        <w:t xml:space="preserve">                        DonHangService.XacNhanDatHang()</w:t>
-        <w:br/>
-        <w:t xml:space="preserve">                                           │</w:t>
-        <w:br/>
-        <w:t xml:space="preserve">          ┌────────────┬──────────────────┬┴───────────────┐</w:t>
-        <w:br/>
-        <w:t xml:space="preserve">          ▼            ▼                  ▼                 ▼</w:t>
-        <w:br/>
-        <w:t xml:space="preserve">    Validate      Đồng bộ giá       Kiểm tra          Áp dụng</w:t>
-        <w:br/>
-        <w:t xml:space="preserve">    đầu vào      từ Repository      Tồn Kho           Voucher</w:t>
-        <w:br/>
-        <w:t xml:space="preserve">          │            │                  │                 │</w:t>
-        <w:br/>
-        <w:t xml:space="preserve">          └────────────┴──────────────────┴─────────────────┘</w:t>
-        <w:br/>
-        <w:t xml:space="preserve">                                           │ (tất cả OK)</w:t>
-        <w:br/>
-        <w:t xml:space="preserve">                                    Lưu Đơn Hàng</w:t>
-        <w:br/>
-        <w:t xml:space="preserve">                                           │</w:t>
-        <w:br/>
-        <w:t xml:space="preserve">                                    Cập Nhật Tồn Kho</w:t>
-        <w:br/>
-        <w:t xml:space="preserve">                                           │</w:t>
-        <w:br/>
-        <w:t xml:space="preserve">                                    Trả Kết Quả</w:t>
-        <w:br/>
-      </w:r>
-    </w:p>
-    <w:p>
-      <w:pPr>
-        <w:pStyle w:val="Heading1"/>
-      </w:pPr>
-      <w:r>
         <w:t>CÂU 3 — TỐI ƯU HÓA KIẾN TRÚC — XỬ LÝ NGOẠI LỆ</w:t>
       </w:r>
     </w:p>
@@ -363,17 +733,33 @@
         <w:pStyle w:val="Heading2"/>
       </w:pPr>
       <w:r>
+        <w:rPr>
+          <w:color w:val="2E86AB"/>
+        </w:rPr>
         <w:t>3.1 Phân Cấp Ngoại Lệ Tùy Chỉnh</w:t>
       </w:r>
     </w:p>
     <w:p>
       <w:r>
         <w:rPr>
+          <w:sz w:val="22"/>
+        </w:rPr>
+        <w:t>Thay vì dùng Exception chung, hệ thống định nghĩa phân cấp ngoại lệ riêng. Mỗi lỗi nghiệp vụ có class riêng chứa đầy đủ thông tin ngữ cảnh.</w:t>
+      </w:r>
+    </w:p>
+    <w:p>
+      <w:pPr>
+        <w:spacing w:before="80" w:after="80"/>
+        <w:ind w:left="567"/>
+        <w:shd w:val="clear" w:color="auto" w:fill="EBF5FB"/>
+      </w:pPr>
+      <w:r>
+        <w:rPr>
           <w:rFonts w:ascii="Courier New" w:hAnsi="Courier New"/>
-          <w:sz w:val="18"/>
+          <w:color w:val="1E3A5F"/>
+          <w:sz w:val="17"/>
         </w:rPr>
-        <w:br/>
-        <w:t>Exception  (hệ thống .NET)</w:t>
+        <w:t>Exception  (.NET system)</w:t>
         <w:br/>
         <w:t xml:space="preserve">    └── NgoaiLeUngDung              ← lỗi gốc của ứng dụng</w:t>
         <w:br/>
@@ -383,16 +769,15 @@
         <w:br/>
         <w:t xml:space="preserve">            ├── SanPhamKhongTonTaiException</w:t>
         <w:br/>
-        <w:t xml:space="preserve">            │      → mã sản phẩm không tồn tại</w:t>
+        <w:t xml:space="preserve">            │      → mã sản phẩm không tồn tại (maSanPham)</w:t>
         <w:br/>
         <w:t xml:space="preserve">            ├── TonKhoKhongDuException</w:t>
         <w:br/>
-        <w:t xml:space="preserve">            │      → số lượng yêu cầu &gt; tồn kho</w:t>
+        <w:t xml:space="preserve">            │      → yêu cầu {soLuong} &gt; tồn kho {hienCo}</w:t>
         <w:br/>
         <w:t xml:space="preserve">            └── VoucherKhongHopLeException</w:t>
         <w:br/>
         <w:t xml:space="preserve">                   → voucher không tồn tại / hết hạn / chưa đủ điều kiện</w:t>
-        <w:br/>
       </w:r>
     </w:p>
     <w:p>
@@ -400,16 +785,24 @@
         <w:pStyle w:val="Heading2"/>
       </w:pPr>
       <w:r>
-        <w:t>3.2 Chiến Lược Xử Lý Trong Service</w:t>
+        <w:rPr>
+          <w:color w:val="2E86AB"/>
+        </w:rPr>
+        <w:t>3.2 Chiến Lược Xử Lý Trong Service Layer</w:t>
       </w:r>
     </w:p>
     <w:p>
+      <w:pPr>
+        <w:spacing w:before="80" w:after="80"/>
+        <w:ind w:left="567"/>
+        <w:shd w:val="clear" w:color="auto" w:fill="EBF5FB"/>
+      </w:pPr>
       <w:r>
         <w:rPr>
           <w:rFonts w:ascii="Courier New" w:hAnsi="Courier New"/>
-          <w:sz w:val="18"/>
+          <w:color w:val="1E3A5F"/>
+          <w:sz w:val="17"/>
         </w:rPr>
-        <w:br/>
         <w:t>public DonHang XacNhanDatHang(DonHang donHang)</w:t>
         <w:br/>
         <w:t>{</w:t>
@@ -418,13 +811,13 @@
         <w:br/>
         <w:t xml:space="preserve">    {</w:t>
         <w:br/>
-        <w:t xml:space="preserve">        KiemTraDonHangHopLe(donHang);   // throw DonHangRongException</w:t>
+        <w:t xml:space="preserve">        KiemTraDonHangHopLe(donHang);   // DonHangRongException</w:t>
         <w:br/>
-        <w:t xml:space="preserve">        DongBoGiaSanPham(donHang);      // throw SanPhamKhongTonTaiException</w:t>
+        <w:t xml:space="preserve">        DongBoGiaSanPham(donHang);      // SanPhamKhongTonTaiException</w:t>
         <w:br/>
-        <w:t xml:space="preserve">        KiemTraTonKho(donHang);         // throw TonKhoKhongDuException</w:t>
+        <w:t xml:space="preserve">        KiemTraTonKho(donHang);         // TonKhoKhongDuException</w:t>
         <w:br/>
-        <w:t xml:space="preserve">        ApDungKhuyenMai(donHang);       // throw VoucherKhongHopLeException</w:t>
+        <w:t xml:space="preserve">        ApDungKhuyenMai(donHang);       // VoucherKhongHopLeException</w:t>
         <w:br/>
         <w:t xml:space="preserve">        var donHangDaLuu = _donHangRepo.Luu(donHang);</w:t>
         <w:br/>
@@ -438,7 +831,7 @@
         <w:br/>
         <w:t xml:space="preserve">    {</w:t>
         <w:br/>
-        <w:t xml:space="preserve">        // Lỗi nghiệp vụ đã biết → log + ném lại cho tầng trên</w:t>
+        <w:t xml:space="preserve">        // Lỗi nghiệp vụ đã biết → log thông báo và ném lại cho tầng trên</w:t>
         <w:br/>
         <w:t xml:space="preserve">        Console.WriteLine($"[LỖI NGHIỆP VỤ] {ex.Message}");</w:t>
         <w:br/>
@@ -450,14 +843,13 @@
         <w:br/>
         <w:t xml:space="preserve">    {</w:t>
         <w:br/>
-        <w:t xml:space="preserve">        // Lỗi hệ thống không mong đợi → bọc lại, che thông tin nội bộ</w:t>
+        <w:t xml:space="preserve">        // Lỗi hệ thống không mong đợi → bọc lại để che thông tin nội bộ</w:t>
         <w:br/>
         <w:t xml:space="preserve">        throw new NgoaiLeUngDung("Lỗi hệ thống khi xử lý đặt hàng.", ex);</w:t>
         <w:br/>
         <w:t xml:space="preserve">    }</w:t>
         <w:br/>
         <w:t>}</w:t>
-        <w:br/>
       </w:r>
     </w:p>
     <w:p>
@@ -465,6 +857,9 @@
         <w:pStyle w:val="Heading2"/>
       </w:pPr>
       <w:r>
+        <w:rPr>
+          <w:color w:val="2E86AB"/>
+        </w:rPr>
         <w:t>3.3 Nguyên Tắc Áp Dụng</w:t>
       </w:r>
     </w:p>
@@ -475,26 +870,34 @@
         <w:tblLook w:firstColumn="1" w:firstRow="1" w:lastColumn="0" w:lastRow="0" w:noHBand="0" w:noVBand="1" w:val="04A0"/>
       </w:tblPr>
       <w:tblGrid>
-        <w:gridCol w:w="4320"/>
-        <w:gridCol w:w="4320"/>
+        <w:gridCol w:w="4703"/>
+        <w:gridCol w:w="4703"/>
       </w:tblGrid>
       <w:tr>
         <w:tc>
           <w:tcPr>
-            <w:tcW w:type="dxa" w:w="4320"/>
+            <w:tcW w:type="dxa" w:w="4703"/>
           </w:tcPr>
           <w:p>
             <w:r>
+              <w:rPr>
+                <w:b/>
+                <w:color w:val="1E3A5F"/>
+              </w:rPr>
               <w:t>Nguyên Tắc</w:t>
             </w:r>
           </w:p>
         </w:tc>
         <w:tc>
           <w:tcPr>
-            <w:tcW w:type="dxa" w:w="4320"/>
+            <w:tcW w:type="dxa" w:w="4703"/>
           </w:tcPr>
           <w:p>
             <w:r>
+              <w:rPr>
+                <w:b/>
+                <w:color w:val="1E3A5F"/>
+              </w:rPr>
               <w:t>Áp Dụng Trong Dự Án</w:t>
             </w:r>
           </w:p>
@@ -503,7 +906,7 @@
       <w:tr>
         <w:tc>
           <w:tcPr>
-            <w:tcW w:type="dxa" w:w="4320"/>
+            <w:tcW w:type="dxa" w:w="4703"/>
           </w:tcPr>
           <w:p>
             <w:r>
@@ -513,11 +916,11 @@
         </w:tc>
         <w:tc>
           <w:tcPr>
-            <w:tcW w:type="dxa" w:w="4320"/>
+            <w:tcW w:type="dxa" w:w="4703"/>
           </w:tcPr>
           <w:p>
             <w:r>
-              <w:t>Validate đơn hàng rỗng ngay đầu hàm</w:t>
+              <w:t>Validate đơn hàng rỗng ngay đầu hàm, không chờ đến bước lưu</w:t>
             </w:r>
           </w:p>
         </w:tc>
@@ -525,7 +928,7 @@
       <w:tr>
         <w:tc>
           <w:tcPr>
-            <w:tcW w:type="dxa" w:w="4320"/>
+            <w:tcW w:type="dxa" w:w="4703"/>
           </w:tcPr>
           <w:p>
             <w:r>
@@ -535,11 +938,11 @@
         </w:tc>
         <w:tc>
           <w:tcPr>
-            <w:tcW w:type="dxa" w:w="4320"/>
+            <w:tcW w:type="dxa" w:w="4703"/>
           </w:tcPr>
           <w:p>
             <w:r>
-              <w:t>Mỗi lỗi có class riêng với thông tin chi tiết</w:t>
+              <w:t>Mỗi lỗi có class riêng chứa thông tin ngữ cảnh đầy đủ</w:t>
             </w:r>
           </w:p>
         </w:tc>
@@ -547,7 +950,7 @@
       <w:tr>
         <w:tc>
           <w:tcPr>
-            <w:tcW w:type="dxa" w:w="4320"/>
+            <w:tcW w:type="dxa" w:w="4703"/>
           </w:tcPr>
           <w:p>
             <w:r>
@@ -557,7 +960,7 @@
         </w:tc>
         <w:tc>
           <w:tcPr>
-            <w:tcW w:type="dxa" w:w="4320"/>
+            <w:tcW w:type="dxa" w:w="4703"/>
           </w:tcPr>
           <w:p>
             <w:r>
@@ -569,7 +972,7 @@
       <w:tr>
         <w:tc>
           <w:tcPr>
-            <w:tcW w:type="dxa" w:w="4320"/>
+            <w:tcW w:type="dxa" w:w="4703"/>
           </w:tcPr>
           <w:p>
             <w:r>
@@ -579,11 +982,11 @@
         </w:tc>
         <w:tc>
           <w:tcPr>
-            <w:tcW w:type="dxa" w:w="4320"/>
+            <w:tcW w:type="dxa" w:w="4703"/>
           </w:tcPr>
           <w:p>
             <w:r>
-              <w:t>Lỗi ngoài bọc bởi NgoaiLeUngDung</w:t>
+              <w:t>Lỗi từ bên ngoài được bọc bởi NgoaiLeUngDung</w:t>
             </w:r>
           </w:p>
         </w:tc>
@@ -591,7 +994,7 @@
       <w:tr>
         <w:tc>
           <w:tcPr>
-            <w:tcW w:type="dxa" w:w="4320"/>
+            <w:tcW w:type="dxa" w:w="4703"/>
           </w:tcPr>
           <w:p>
             <w:r>
@@ -601,19 +1004,91 @@
         </w:tc>
         <w:tc>
           <w:tcPr>
-            <w:tcW w:type="dxa" w:w="4320"/>
+            <w:tcW w:type="dxa" w:w="4703"/>
           </w:tcPr>
           <w:p>
             <w:r>
-              <w:t>Thông điệp lỗi tiếng Việt rõ ràng cho người dùng</w:t>
+              <w:t>Thông điệp lỗi tiếng Việt, rõ ràng cho người dùng cuối</w:t>
             </w:r>
           </w:p>
         </w:tc>
       </w:tr>
     </w:tbl>
+    <w:p/>
+    <w:p>
+      <w:pPr>
+        <w:pStyle w:val="Heading1"/>
+      </w:pPr>
+      <w:r>
+        <w:rPr>
+          <w:color w:val="1E3A5F"/>
+        </w:rPr>
+        <w:t>QUYẾT ĐỊNH KIẾN TRÚC</w:t>
+      </w:r>
+    </w:p>
+    <w:p>
+      <w:pPr>
+        <w:pStyle w:val="Heading2"/>
+      </w:pPr>
+      <w:r>
+        <w:rPr>
+          <w:color w:val="2E86AB"/>
+        </w:rPr>
+        <w:t>Tại Sao Dùng Repository Pattern?</w:t>
+      </w:r>
+    </w:p>
+    <w:p>
+      <w:r>
+        <w:rPr>
+          <w:sz w:val="22"/>
+        </w:rPr>
+        <w:t>Repository Pattern tạo lớp trừu tượng giữa tầng nghiệp vụ và dữ liệu. Khi cần chuyển từ dữ liệu in-memory sang SQL Server thực, chỉ cần tạo class repository mới implement cùng interface — không thay đổi bất kỳ dòng code nào trong Service.</w:t>
+      </w:r>
+    </w:p>
+    <w:p/>
+    <w:p>
+      <w:pPr>
+        <w:pStyle w:val="Heading2"/>
+      </w:pPr>
+      <w:r>
+        <w:rPr>
+          <w:color w:val="2E86AB"/>
+        </w:rPr>
+        <w:t>Tại Sao Dùng Dependency Injection?</w:t>
+      </w:r>
+    </w:p>
+    <w:p>
+      <w:r>
+        <w:rPr>
+          <w:sz w:val="22"/>
+        </w:rPr>
+        <w:t>DonHangService nhận các dependency qua constructor thay vì tự khởi tạo. Điều này giúp dễ viết unit test (mock dependency), tuân thủ Dependency Inversion Principle, và dễ thay thế implementation (ví dụ: đổi sang Redis cache).</w:t>
+      </w:r>
+    </w:p>
+    <w:p/>
+    <w:p>
+      <w:pPr>
+        <w:pStyle w:val="Heading2"/>
+      </w:pPr>
+      <w:r>
+        <w:rPr>
+          <w:color w:val="2E86AB"/>
+        </w:rPr>
+        <w:t>Tại Sao Dùng Builder Thay Vì Constructor?</w:t>
+      </w:r>
+    </w:p>
+    <w:p>
+      <w:r>
+        <w:rPr>
+          <w:sz w:val="22"/>
+        </w:rPr>
+        <w:t>DonHang có nhiều thuộc tính tùy chọn. Nếu dùng constructor sẽ cần nhiều overload hoặc tham số quá nhiều (khó đọc, dễ nhầm thứ tự). Builder cho phép tạo đơn hàng từng bước, dễ đọc và mở rộng.</w:t>
+      </w:r>
+    </w:p>
+    <w:p/>
     <w:sectPr>
       <w:pgSz w:w="12240" w:h="15840"/>
-      <w:pgMar w:top="1440" w:right="1800" w:bottom="1440" w:left="1800" w:header="720" w:footer="720" w:gutter="0"/>
+      <w:pgMar w:top="1134" w:right="1417" w:bottom="1134" w:left="1417" w:header="720" w:footer="720" w:gutter="0"/>
       <w:cols w:space="720"/>
       <w:docGrid w:linePitch="360"/>
     </w:sectPr>

</xml_diff>